<commit_message>
Listas predefinidas: usuarios, proveedores e idiomas
- USERS: añadidas Lourdes y Natalia
- PROVIDERS: Accenture, INAP, Mercadona, Test Provider (siempre visibles en filtro)
- LANGUAGES: Español, Inglés, Catalán, Euskera, Gallego
- Formulario nuevo curso: proveedor e idioma pasan de input a select
- renderFilters: fProv usa PROVIDERS como base + extras de los datos
- README y guía Word actualizados con las tres listas

Co-Authored-By: Claude Sonnet 4.6 <noreply@anthropic.com>
</commit_message>
<xml_diff>
--- a/CourseTrack_Guia_Usuario.docx
+++ b/CourseTrack_Guia_Usuario.docx
@@ -723,7 +723,7 @@
         <w:rPr>
           <w:sz w:val="21"/>
         </w:rPr>
-        <w:t>Proveedor (obligatorio)</w:t>
+        <w:t>Proveedor (obligatorio) — selector con la lista predefinida: Accenture, INAP, Mercadona, Test Provider.</w:t>
       </w:r>
     </w:p>
     <w:p>
@@ -759,7 +759,7 @@
         <w:rPr>
           <w:sz w:val="21"/>
         </w:rPr>
-        <w:t>Idioma (por defecto Español)</w:t>
+        <w:t>Idioma — selector con Español, Inglés, Catalán, Euskera y Gallego (por defecto Español).</w:t>
       </w:r>
     </w:p>
     <w:p>
@@ -1930,7 +1930,7 @@
         <w:spacing w:before="160" w:after="80"/>
       </w:pPr>
       <w:r>
-        <w:t>9.4 Gestión de la lista de usuarios</w:t>
+        <w:t>9.4 Gestión de las listas predefinidas</w:t>
       </w:r>
     </w:p>
     <w:p>
@@ -1941,7 +1941,7 @@
         <w:rPr>
           <w:sz w:val="21"/>
         </w:rPr>
-        <w:t>La lista de usuarios está hardcodeada en index.html. Para añadir o eliminar un usuario:</w:t>
+        <w:t>Tres arrays hardcodeados en index.html (~línea 792) controlan los valores disponibles en los selectores de la aplicación:</w:t>
       </w:r>
     </w:p>
     <w:p>
@@ -1949,11 +1949,18 @@
         <w:pStyle w:val="ListBullet"/>
         <w:spacing w:after="60"/>
       </w:pPr>
+      <w:r>
+        <w:rPr>
+          <w:b/>
+          <w:sz w:val="21"/>
+        </w:rPr>
+        <w:t>USERS</w:t>
+      </w:r>
       <w:r>
         <w:rPr>
           <w:sz w:val="21"/>
         </w:rPr>
-        <w:t>Abrir index.html y localizar el array USERS (aproximadamente en la línea 792).</w:t>
+        <w:t xml:space="preserve"> — miembros del equipo que pueden identificarse al acceder.</w:t>
       </w:r>
     </w:p>
     <w:p>
@@ -1961,11 +1968,72 @@
         <w:pStyle w:val="ListBullet"/>
         <w:spacing w:after="60"/>
       </w:pPr>
+      <w:r>
+        <w:rPr>
+          <w:b/>
+          <w:sz w:val="21"/>
+        </w:rPr>
+        <w:t>PROVIDERS</w:t>
+      </w:r>
       <w:r>
         <w:rPr>
           <w:sz w:val="21"/>
         </w:rPr>
-        <w:t>Editar la lista de nombres.</w:t>
+        <w:t xml:space="preserve"> — proveedores disponibles en el filtro del toolbar y en el formulario de alta de curso.</w:t>
+      </w:r>
+    </w:p>
+    <w:p>
+      <w:pPr>
+        <w:pStyle w:val="ListBullet"/>
+        <w:spacing w:after="60"/>
+      </w:pPr>
+      <w:r>
+        <w:rPr>
+          <w:b/>
+          <w:sz w:val="21"/>
+        </w:rPr>
+        <w:t>LANGUAGES</w:t>
+      </w:r>
+      <w:r>
+        <w:rPr>
+          <w:sz w:val="21"/>
+        </w:rPr>
+        <w:t xml:space="preserve"> — idiomas disponibles en el formulario de alta de curso (el primero es el valor por defecto).</w:t>
+      </w:r>
+    </w:p>
+    <w:p>
+      <w:pPr>
+        <w:spacing w:after="120"/>
+      </w:pPr>
+      <w:r>
+        <w:rPr>
+          <w:sz w:val="21"/>
+        </w:rPr>
+        <w:t>Para añadir o eliminar valores en cualquiera de las tres listas:</w:t>
+      </w:r>
+    </w:p>
+    <w:p>
+      <w:pPr>
+        <w:pStyle w:val="ListBullet"/>
+        <w:spacing w:after="60"/>
+      </w:pPr>
+      <w:r>
+        <w:rPr>
+          <w:sz w:val="21"/>
+        </w:rPr>
+        <w:t>Abrir index.html y localizar los arrays (aproximadamente en la línea 792).</w:t>
+      </w:r>
+    </w:p>
+    <w:p>
+      <w:pPr>
+        <w:pStyle w:val="ListBullet"/>
+        <w:spacing w:after="60"/>
+      </w:pPr>
+      <w:r>
+        <w:rPr>
+          <w:sz w:val="21"/>
+        </w:rPr>
+        <w:t>Editar la lista de valores.</w:t>
       </w:r>
     </w:p>
     <w:p>

</xml_diff>

<commit_message>
Actualizar guía y README: editar incidencias y cursos
- README: añadida tabla de funcionalidades principales con ✏ Editar curso y ✏ Editar incidencia
- Guía Word (gen_guia_coursetrack.py): nuevo §4.2 Editar un curso, §6.3 menciona botón editar en tarjetas de incidencia, §6.4 incluye botón ✏ Editar curso, §7 renombrado a Gestión de incidencias, nuevo §7.2 Editar una incidencia, §7.3 Resolver una incidencia
- CourseTrack_Guia_Usuario.docx regenerado

Co-Authored-By: Claude Sonnet 4.6 <noreply@anthropic.com>
</commit_message>
<xml_diff>
--- a/CourseTrack_Guia_Usuario.docx
+++ b/CourseTrack_Guia_Usuario.docx
@@ -803,7 +803,122 @@
         <w:spacing w:before="160" w:after="80"/>
       </w:pPr>
       <w:r>
-        <w:t>4.2 Eliminar un curso</w:t>
+        <w:t>4.2 Editar un curso</w:t>
+      </w:r>
+    </w:p>
+    <w:p>
+      <w:pPr>
+        <w:spacing w:after="120"/>
+      </w:pPr>
+      <w:r>
+        <w:rPr>
+          <w:sz w:val="21"/>
+        </w:rPr>
+        <w:t>Para modificar los datos de un curso ya creado, abrir su panel de detalle y pulsar ✏ Editar curso en la barra de acciones inferior. El modal se abre con todos los campos pre-rellenados y permite modificar:</w:t>
+      </w:r>
+    </w:p>
+    <w:p>
+      <w:pPr>
+        <w:pStyle w:val="ListBullet"/>
+        <w:spacing w:after="60"/>
+      </w:pPr>
+      <w:r>
+        <w:rPr>
+          <w:sz w:val="21"/>
+        </w:rPr>
+        <w:t>Nombre del curso</w:t>
+      </w:r>
+    </w:p>
+    <w:p>
+      <w:pPr>
+        <w:pStyle w:val="ListBullet"/>
+        <w:spacing w:after="60"/>
+      </w:pPr>
+      <w:r>
+        <w:rPr>
+          <w:sz w:val="21"/>
+        </w:rPr>
+        <w:t>Código interno</w:t>
+      </w:r>
+    </w:p>
+    <w:p>
+      <w:pPr>
+        <w:pStyle w:val="ListBullet"/>
+        <w:spacing w:after="60"/>
+      </w:pPr>
+      <w:r>
+        <w:rPr>
+          <w:sz w:val="21"/>
+        </w:rPr>
+        <w:t>Proveedor (selector predefinido)</w:t>
+      </w:r>
+    </w:p>
+    <w:p>
+      <w:pPr>
+        <w:pStyle w:val="ListBullet"/>
+        <w:spacing w:after="60"/>
+      </w:pPr>
+      <w:r>
+        <w:rPr>
+          <w:sz w:val="21"/>
+        </w:rPr>
+        <w:t>Estándar SCORM</w:t>
+      </w:r>
+    </w:p>
+    <w:p>
+      <w:pPr>
+        <w:pStyle w:val="ListBullet"/>
+        <w:spacing w:after="60"/>
+      </w:pPr>
+      <w:r>
+        <w:rPr>
+          <w:sz w:val="21"/>
+        </w:rPr>
+        <w:t>Duración estimada</w:t>
+      </w:r>
+    </w:p>
+    <w:p>
+      <w:pPr>
+        <w:pStyle w:val="ListBullet"/>
+        <w:spacing w:after="60"/>
+      </w:pPr>
+      <w:r>
+        <w:rPr>
+          <w:sz w:val="21"/>
+        </w:rPr>
+        <w:t>Idioma (selector predefinido)</w:t>
+      </w:r>
+    </w:p>
+    <w:p>
+      <w:pPr>
+        <w:pStyle w:val="ListBullet"/>
+        <w:spacing w:after="60"/>
+      </w:pPr>
+      <w:r>
+        <w:rPr>
+          <w:sz w:val="21"/>
+        </w:rPr>
+        <w:t>Notas internas</w:t>
+      </w:r>
+    </w:p>
+    <w:p>
+      <w:pPr>
+        <w:spacing w:after="160"/>
+      </w:pPr>
+      <w:r>
+        <w:rPr>
+          <w:sz w:val="21"/>
+        </w:rPr>
+        <w:t>Al confirmar, los cambios se guardan inmediatamente y se sincronizan con Google Sheets.</w:t>
+      </w:r>
+    </w:p>
+    <w:p>
+      <w:pPr>
+        <w:pStyle w:val="Heading2"/>
+        <w:spacing w:before="160" w:after="80"/>
+      </w:pPr>
+      <w:r>
+        <w:t>4.3 Eliminar un curso</w:t>
       </w:r>
     </w:p>
     <w:p>
@@ -1355,11 +1470,52 @@
     </w:p>
     <w:p>
       <w:pPr>
+        <w:spacing w:after="160"/>
+      </w:pPr>
+      <w:r>
+        <w:rPr>
+          <w:sz w:val="21"/>
+        </w:rPr>
+        <w:t>Cada tarjeta incluye una barra de acciones en la parte inferior con los botones ✏ Editar incidencia (disponible siempre) y Resolver ✓ (solo en incidencias abiertas).</w:t>
+      </w:r>
+    </w:p>
+    <w:p>
+      <w:pPr>
         <w:pStyle w:val="Heading2"/>
         <w:spacing w:before="160" w:after="80"/>
       </w:pPr>
       <w:r>
         <w:t>6.4 Acciones desde el panel</w:t>
+      </w:r>
+    </w:p>
+    <w:p>
+      <w:pPr>
+        <w:spacing w:after="120"/>
+      </w:pPr>
+      <w:r>
+        <w:rPr>
+          <w:sz w:val="21"/>
+        </w:rPr>
+        <w:t>La barra de acciones en la parte inferior del panel contiene:</w:t>
+      </w:r>
+    </w:p>
+    <w:p>
+      <w:pPr>
+        <w:pStyle w:val="ListBullet"/>
+        <w:spacing w:after="60"/>
+      </w:pPr>
+      <w:r>
+        <w:rPr>
+          <w:b/>
+          <w:sz w:val="21"/>
+        </w:rPr>
+        <w:t>✏ Editar curso:</w:t>
+      </w:r>
+      <w:r>
+        <w:rPr>
+          <w:sz w:val="21"/>
+        </w:rPr>
+        <w:t xml:space="preserve"> abre el modal de edición con todos los campos del curso pre-rellenados.</w:t>
       </w:r>
     </w:p>
     <w:p>
@@ -1378,7 +1534,7 @@
         <w:rPr>
           <w:sz w:val="21"/>
         </w:rPr>
-        <w:t xml:space="preserve"> mueve el curso al siguiente estado del ciclo.</w:t>
+        <w:t xml:space="preserve"> mueve el curso al siguiente estado del ciclo y crea una versión menor.</w:t>
       </w:r>
     </w:p>
     <w:p>
@@ -1397,7 +1553,7 @@
         <w:rPr>
           <w:sz w:val="21"/>
         </w:rPr>
-        <w:t xml:space="preserve"> registra una entrega mayor del proveedor (p. ej. de v1.x a v2.0).</w:t>
+        <w:t xml:space="preserve"> registra una reentrega mayor del proveedor (p. ej. de v1.x a v2.0).</w:t>
       </w:r>
     </w:p>
     <w:p>
@@ -1410,13 +1566,13 @@
           <w:b/>
           <w:sz w:val="21"/>
         </w:rPr>
-        <w:t>⚡ Incidencia:</w:t>
+        <w:t>⚡ Nueva incidencia:</w:t>
       </w:r>
       <w:r>
         <w:rPr>
           <w:sz w:val="21"/>
         </w:rPr>
-        <w:t xml:space="preserve"> registra un nuevo error detectado en la revisión actual.</w:t>
+        <w:t xml:space="preserve"> abre el formulario para registrar un nuevo error detectado en la revisión.</w:t>
       </w:r>
     </w:p>
     <w:p>
@@ -1447,7 +1603,7 @@
         <w:rPr>
           <w:color w:val="3B82F6"/>
         </w:rPr>
-        <w:t>7. Registrar una incidencia</w:t>
+        <w:t>7. Gestión de incidencias</w:t>
       </w:r>
     </w:p>
     <w:p>
@@ -1458,7 +1614,27 @@
         <w:rPr>
           <w:sz w:val="21"/>
         </w:rPr>
-        <w:t>Desde el panel de detalle → botón ⚡ Incidencia. El formulario solicita:</w:t>
+        <w:t>Las incidencias registran los errores o problemas detectados durante la revisión de un curso. Cada incidencia queda asociada a la versión activa del curso en el momento del registro y se muestra en la pestaña Incidencias del panel de detalle.</w:t>
+      </w:r>
+    </w:p>
+    <w:p>
+      <w:pPr>
+        <w:pStyle w:val="Heading2"/>
+        <w:spacing w:before="160" w:after="80"/>
+      </w:pPr>
+      <w:r>
+        <w:t>7.1 Registrar una nueva incidencia</w:t>
+      </w:r>
+    </w:p>
+    <w:p>
+      <w:pPr>
+        <w:spacing w:after="120"/>
+      </w:pPr>
+      <w:r>
+        <w:rPr>
+          <w:sz w:val="21"/>
+        </w:rPr>
+        <w:t>Desde el panel de detalle → botón ⚡ Nueva incidencia. El formulario solicita:</w:t>
       </w:r>
     </w:p>
     <w:p>
@@ -1529,7 +1705,7 @@
         <w:rPr>
           <w:sz w:val="21"/>
         </w:rPr>
-        <w:t>La incidencia queda asociada a la versión activa del curso en el momento del registro. Al confirmar, la app cambia automáticamente a la pestaña Incidencias del panel.</w:t>
+        <w:t>Al confirmar, la app cambia automáticamente a la pestaña Incidencias del panel.</w:t>
       </w:r>
     </w:p>
     <w:p>
@@ -1538,18 +1714,110 @@
         <w:spacing w:before="160" w:after="80"/>
       </w:pPr>
       <w:r>
-        <w:t>7.1 Resolver una incidencia</w:t>
+        <w:t>7.2 Editar una incidencia</w:t>
       </w:r>
     </w:p>
     <w:p>
       <w:pPr>
-        <w:spacing w:after="160"/>
+        <w:spacing w:after="120"/>
       </w:pPr>
       <w:r>
         <w:rPr>
           <w:sz w:val="21"/>
         </w:rPr>
-        <w:t>En la pestaña Incidencias, cada tarjeta abierta muestra el botón Resolver ✓. Al pulsarlo se pide un texto de resolución (opcional) y la incidencia pasa a Resuelta, con su tarjeta marcada en verde. Las incidencias resueltas se conservan en el historial; no se eliminan.</w:t>
+        <w:t>Todas las incidencias (abiertas y resueltas) pueden editarse en cualquier momento. En la pestaña Incidencias, cada tarjeta muestra el botón ✏ Editar incidencia en su barra de acciones inferior. El modal de edición incluye todos los campos:</w:t>
+      </w:r>
+    </w:p>
+    <w:p>
+      <w:pPr>
+        <w:pStyle w:val="ListBullet"/>
+        <w:spacing w:after="60"/>
+      </w:pPr>
+      <w:r>
+        <w:rPr>
+          <w:sz w:val="21"/>
+        </w:rPr>
+        <w:t>Categoría y severidad</w:t>
+      </w:r>
+    </w:p>
+    <w:p>
+      <w:pPr>
+        <w:pStyle w:val="ListBullet"/>
+        <w:spacing w:after="60"/>
+      </w:pPr>
+      <w:r>
+        <w:rPr>
+          <w:sz w:val="21"/>
+        </w:rPr>
+        <w:t>Título y descripción detallada</w:t>
+      </w:r>
+    </w:p>
+    <w:p>
+      <w:pPr>
+        <w:pStyle w:val="ListBullet"/>
+        <w:spacing w:after="60"/>
+      </w:pPr>
+      <w:r>
+        <w:rPr>
+          <w:sz w:val="21"/>
+        </w:rPr>
+        <w:t>Fecha de detección</w:t>
+      </w:r>
+    </w:p>
+    <w:p>
+      <w:pPr>
+        <w:pStyle w:val="ListBullet"/>
+        <w:spacing w:after="60"/>
+      </w:pPr>
+      <w:r>
+        <w:rPr>
+          <w:sz w:val="21"/>
+        </w:rPr>
+        <w:t>Estado (Abierta / Resuelta) — al marcar como Resuelta aparece el campo de texto de resolución</w:t>
+      </w:r>
+    </w:p>
+    <w:p>
+      <w:pPr>
+        <w:pStyle w:val="ListBullet"/>
+        <w:spacing w:after="60"/>
+      </w:pPr>
+      <w:r>
+        <w:rPr>
+          <w:sz w:val="21"/>
+        </w:rPr>
+        <w:t>Texto de resolución (editable si la incidencia está resuelta)</w:t>
+      </w:r>
+    </w:p>
+    <w:p>
+      <w:pPr>
+        <w:spacing w:after="160"/>
+      </w:pPr>
+      <w:r>
+        <w:rPr>
+          <w:color w:val="64748B"/>
+          <w:sz w:val="21"/>
+        </w:rPr>
+        <w:t>Los campos de trazabilidad (Creada por, Última edición, Resuelta por) se muestran en modo solo lectura dentro del modal. Al guardar, se registran editadoPor y fechaEdicion con el usuario activo y la fecha actual.</w:t>
+      </w:r>
+    </w:p>
+    <w:p>
+      <w:pPr>
+        <w:pStyle w:val="Heading2"/>
+        <w:spacing w:before="160" w:after="80"/>
+      </w:pPr>
+      <w:r>
+        <w:t>7.3 Resolver una incidencia</w:t>
+      </w:r>
+    </w:p>
+    <w:p>
+      <w:pPr>
+        <w:spacing w:after="160"/>
+      </w:pPr>
+      <w:r>
+        <w:rPr>
+          <w:sz w:val="21"/>
+        </w:rPr>
+        <w:t>En la pestaña Incidencias, cada tarjeta abierta muestra el botón Resolver ✓ en su barra de acciones. Al pulsarlo se pide un texto de resolución (opcional) y la incidencia pasa a Resuelta, con su tarjeta marcada en verde. Las incidencias resueltas se conservan en el historial; no se eliminan.</w:t>
       </w:r>
     </w:p>
     <w:p>

</xml_diff>